<commit_message>
RCA workflow beta version
</commit_message>
<xml_diff>
--- a/src/dackar/RCA/diagrams/april_2/Architecture_Assessment.docx
+++ b/src/dackar/RCA/diagrams/april_2/Architecture_Assessment.docx
@@ -65,7 +65,7 @@
         <w:t xml:space="preserve">KG narrowing → temporal scoring → candidate generation → evidence retrieval → evidence refinement → synthesis. </w:t>
       </w:r>
       <w:r>
-        <w:pict w14:anchorId="7A908C2A">
+        <w:pict w14:anchorId="03019E22">
           <v:rect id="Horizontal Line 1" o:spid="_x0000_s1032" alt="" style="width:468pt;height:.05pt;visibility:visible;mso-wrap-style:square;mso-width-percent:0;mso-height-percent:0;mso-left-percent:-10001;mso-top-percent:-10001;mso-position-horizontal:absolute;mso-position-horizontal-relative:char;mso-position-vertical:absolute;mso-position-vertical-relative:line;mso-width-percent:0;mso-height-percent:0;mso-left-percent:-10001;mso-top-percent:-10001;v-text-anchor:top" filled="f">
             <o:lock v:ext="edit" rotation="t" aspectratio="t" verticies="t" text="t" shapetype="t"/>
             <w10:anchorlock/>
@@ -1179,7 +1179,7 @@
         </w:rPr>
       </w:pPr>
       <w:r>
-        <w:pict w14:anchorId="0FEF32FD">
+        <w:pict w14:anchorId="026493E2">
           <v:rect id="Horizontal Line 2" o:spid="_x0000_s1031" alt="" style="width:468pt;height:1.1pt;visibility:visible;mso-wrap-style:square;mso-width-percent:0;mso-height-percent:0;mso-left-percent:-10001;mso-top-percent:-10001;mso-position-horizontal:absolute;mso-position-horizontal-relative:char;mso-position-vertical:absolute;mso-position-vertical-relative:line;mso-width-percent:0;mso-height-percent:0;mso-left-percent:-10001;mso-top-percent:-10001;v-text-anchor:top" filled="f">
             <o:lock v:ext="edit" rotation="t" aspectratio="t" verticies="t" text="t" shapetype="t"/>
             <w10:anchorlock/>
@@ -1854,7 +1854,7 @@
         </w:rPr>
       </w:pPr>
       <w:r>
-        <w:pict w14:anchorId="356F9435">
+        <w:pict w14:anchorId="54CC5F7C">
           <v:rect id="Horizontal Line 3" o:spid="_x0000_s1030" alt="" style="width:468pt;height:1.1pt;visibility:visible;mso-wrap-style:square;mso-width-percent:0;mso-height-percent:0;mso-left-percent:-10001;mso-top-percent:-10001;mso-position-horizontal:absolute;mso-position-horizontal-relative:char;mso-position-vertical:absolute;mso-position-vertical-relative:line;mso-width-percent:0;mso-height-percent:0;mso-left-percent:-10001;mso-top-percent:-10001;v-text-anchor:top" filled="f">
             <o:lock v:ext="edit" rotation="t" aspectratio="t" verticies="t" text="t" shapetype="t"/>
             <w10:anchorlock/>
@@ -2165,7 +2165,7 @@
         </w:rPr>
       </w:pPr>
       <w:r>
-        <w:pict w14:anchorId="00ED5EB3">
+        <w:pict w14:anchorId="5FA69CFA">
           <v:rect id="Horizontal Line 4" o:spid="_x0000_s1029" alt="" style="width:468pt;height:1.1pt;visibility:visible;mso-wrap-style:square;mso-width-percent:0;mso-height-percent:0;mso-left-percent:-10001;mso-top-percent:-10001;mso-position-horizontal:absolute;mso-position-horizontal-relative:char;mso-position-vertical:absolute;mso-position-vertical-relative:line;mso-width-percent:0;mso-height-percent:0;mso-left-percent:-10001;mso-top-percent:-10001;v-text-anchor:top" filled="f">
             <o:lock v:ext="edit" rotation="t" aspectratio="t" verticies="t" text="t" shapetype="t"/>
             <w10:anchorlock/>
@@ -2537,7 +2537,7 @@
         </w:rPr>
       </w:pPr>
       <w:r>
-        <w:pict w14:anchorId="2F3B88A8">
+        <w:pict w14:anchorId="7BE965D1">
           <v:rect id="Horizontal Line 5" o:spid="_x0000_s1028" alt="" style="width:468pt;height:1.1pt;visibility:visible;mso-wrap-style:square;mso-width-percent:0;mso-height-percent:0;mso-left-percent:-10001;mso-top-percent:-10001;mso-position-horizontal:absolute;mso-position-horizontal-relative:char;mso-position-vertical:absolute;mso-position-vertical-relative:line;mso-width-percent:0;mso-height-percent:0;mso-left-percent:-10001;mso-top-percent:-10001;v-text-anchor:top" filled="f">
             <o:lock v:ext="edit" rotation="t" aspectratio="t" verticies="t" text="t" shapetype="t"/>
             <w10:anchorlock/>
@@ -4398,7 +4398,7 @@
         </w:rPr>
       </w:pPr>
       <w:r>
-        <w:pict w14:anchorId="57FC1B0D">
+        <w:pict w14:anchorId="2E7D67AE">
           <v:rect id="Horizontal Line 6" o:spid="_x0000_s1027" alt="" style="width:468pt;height:.05pt;visibility:visible;mso-wrap-style:square;mso-width-percent:0;mso-height-percent:0;mso-left-percent:-10001;mso-top-percent:-10001;mso-position-horizontal:absolute;mso-position-horizontal-relative:char;mso-position-vertical:absolute;mso-position-vertical-relative:line;mso-width-percent:0;mso-height-percent:0;mso-left-percent:-10001;mso-top-percent:-10001;v-text-anchor:top" filled="f">
             <o:lock v:ext="edit" rotation="t" aspectratio="t" verticies="t" text="t" shapetype="t"/>
             <w10:anchorlock/>
@@ -4661,7 +4661,7 @@
         </w:rPr>
       </w:pPr>
       <w:r>
-        <w:pict w14:anchorId="0750F907">
+        <w:pict w14:anchorId="6661CF46">
           <v:rect id="Horizontal Line 7" o:spid="_x0000_s1026" alt="" style="width:468pt;height:1.1pt;visibility:visible;mso-wrap-style:square;mso-width-percent:0;mso-height-percent:0;mso-left-percent:-10001;mso-top-percent:-10001;mso-position-horizontal:absolute;mso-position-horizontal-relative:char;mso-position-vertical:absolute;mso-position-vertical-relative:line;mso-width-percent:0;mso-height-percent:0;mso-left-percent:-10001;mso-top-percent:-10001;v-text-anchor:top" filled="f">
             <o:lock v:ext="edit" rotation="t" aspectratio="t" verticies="t" text="t" shapetype="t"/>
             <w10:anchorlock/>

</xml_diff>